<commit_message>
merge timing into status page, remove planning ascent screen
</commit_message>
<xml_diff>
--- a/29029-beta-test-brief.docx
+++ b/29029-beta-test-brief.docx
@@ -4,20 +4,20 @@
   <w:body>
     <w:p>
       <w:pPr>
-        <w:spacing w:before="0" w:after="80"/>
+        <w:spacing w:after="40"/>
       </w:pPr>
       <w:r>
         <w:rPr>
           <w:b/>
-          <w:color w:val="7A2A3A"/>
-          <w:sz w:val="56"/>
+          <w:color w:val="A85878"/>
+          <w:sz w:val="48"/>
         </w:rPr>
-        <w:t>29029 Whistler Team App</w:t>
+        <w:t>29029 Whistler Women's Team App</w:t>
       </w:r>
     </w:p>
     <w:p>
       <w:pPr>
-        <w:spacing w:after="40"/>
+        <w:spacing w:after="120"/>
       </w:pPr>
       <w:r>
         <w:rPr>
@@ -29,20 +29,24 @@
     </w:p>
     <w:p>
       <w:pPr>
-        <w:spacing w:before="120" w:after="120"/>
-        <w:pBdr>
-          <w:bottom w:val="single" w:sz="4" w:space="1" w:color="DDD0BE"/>
-        </w:pBdr>
+        <w:spacing w:after="120"/>
       </w:pPr>
+      <w:r>
+        <w:rPr>
+          <w:color w:val="DDD0BE"/>
+          <w:sz w:val="18"/>
+        </w:rPr>
+        <w:t>───────────────────────────────────────────────────────</w:t>
+      </w:r>
     </w:p>
     <w:p>
       <w:pPr>
-        <w:spacing w:before="360" w:after="120"/>
+        <w:spacing w:before="360" w:after="80"/>
       </w:pPr>
       <w:r>
         <w:rPr>
           <w:b/>
-          <w:color w:val="7A2A3A"/>
+          <w:color w:val="A85878"/>
           <w:sz w:val="36"/>
         </w:rPr>
         <w:t>What Is This?</w:t>
@@ -50,46 +54,24 @@
     </w:p>
     <w:p>
       <w:pPr>
-        <w:spacing w:after="120"/>
+        <w:spacing w:after="80"/>
       </w:pPr>
       <w:r>
         <w:rPr>
-          <w:i w:val="0"/>
           <w:color w:val="1E1610"/>
           <w:sz w:val="22"/>
         </w:rPr>
-        <w:t>The 29029 Whistler Team App is a private, real-time situational awareness board built for our group of 10 women competing in 29029 Whistler — a mountaineering challenge of climbing 29,029 vertical feet (the height of Everest) over 36 hours.</w:t>
+        <w:t>A private, real-time tracking app built for our 10-woman team taking on the 29029 Whistler challenge. It lets each athlete update her status and ascent count, while the rest of the team and our supporters follow along live. No logins, no passwords — just tap your name and go.</w:t>
       </w:r>
     </w:p>
     <w:p>
       <w:pPr>
-        <w:spacing w:after="120"/>
-      </w:pPr>
-      <w:r>
-        <w:rPr>
-          <w:i w:val="0"/>
-          <w:color w:val="1E1610"/>
-          <w:sz w:val="22"/>
-        </w:rPr>
-        <w:t>This isn't a race tracker. It's a shared dashboard so the team always knows where everyone is, and so friends and family can follow along without blowing up the group chat.</w:t>
-      </w:r>
-    </w:p>
-    <w:p>
-      <w:pPr>
-        <w:spacing w:before="120" w:after="120"/>
-        <w:pBdr>
-          <w:bottom w:val="single" w:sz="4" w:space="1" w:color="DDD0BE"/>
-        </w:pBdr>
-      </w:pPr>
-    </w:p>
-    <w:p>
-      <w:pPr>
-        <w:spacing w:before="360" w:after="120"/>
+        <w:spacing w:before="360" w:after="80"/>
       </w:pPr>
       <w:r>
         <w:rPr>
           <w:b/>
-          <w:color w:val="7A2A3A"/>
+          <w:color w:val="A85878"/>
           <w:sz w:val="36"/>
         </w:rPr>
         <w:t>The Challenge</w:t>
@@ -97,72 +79,127 @@
     </w:p>
     <w:p>
       <w:pPr>
-        <w:pStyle w:val="ListBullet"/>
-        <w:spacing w:after="60"/>
+        <w:spacing w:after="80"/>
       </w:pPr>
       <w:r>
         <w:rPr>
           <w:color w:val="1E1610"/>
           <w:sz w:val="22"/>
         </w:rPr>
-        <w:t>8 ascents of Whistler Mountain per athlete</w:t>
+        <w:t>29029 Whistler is a 36-hour mountaineering challenge at Whistler Blackcomb. Participants climb to the summit repeatedly, targeting 29,029 vertical feet — the height of Everest — across 8 ascents. Our team: 10 women, 8 ascents each, one mountain.</w:t>
       </w:r>
     </w:p>
     <w:p>
       <w:pPr>
-        <w:pStyle w:val="ListBullet"/>
-        <w:spacing w:after="60"/>
+        <w:spacing w:before="360" w:after="80"/>
+      </w:pPr>
+      <w:r>
+        <w:rPr>
+          <w:b/>
+          <w:color w:val="A85878"/>
+          <w:sz w:val="36"/>
+        </w:rPr>
+        <w:t>How to Access the App</w:t>
+      </w:r>
+    </w:p>
+    <w:p>
+      <w:pPr>
+        <w:spacing w:before="200" w:after="40"/>
+      </w:pPr>
+      <w:r>
+        <w:rPr>
+          <w:b/>
+          <w:color w:val="1E1610"/>
+          <w:sz w:val="24"/>
+        </w:rPr>
+        <w:t>Athlete view (that’s you)</w:t>
+      </w:r>
+    </w:p>
+    <w:p>
+      <w:pPr>
+        <w:spacing w:after="80"/>
+      </w:pPr>
+      <w:r>
+        <w:rPr>
+          <w:b/>
+          <w:color w:val="1E1610"/>
+          <w:sz w:val="22"/>
+        </w:rPr>
+        <w:t xml:space="preserve">URL:  </w:t>
+      </w:r>
+      <w:r>
+        <w:rPr>
+          <w:color w:val="1E1610"/>
+          <w:sz w:val="22"/>
+        </w:rPr>
+        <w:t>[YOUR NETLIFY URL HERE]</w:t>
+      </w:r>
+    </w:p>
+    <w:p>
+      <w:pPr>
+        <w:spacing w:after="80"/>
       </w:pPr>
       <w:r>
         <w:rPr>
           <w:color w:val="1E1610"/>
           <w:sz w:val="22"/>
         </w:rPr>
-        <w:t>~29,029 vertical feet total</w:t>
+        <w:t>Open on your iPhone. When prompted, tap your name. Your device remembers you — you won’t need to select your name again unless you clear your browser data.</w:t>
       </w:r>
     </w:p>
     <w:p>
       <w:pPr>
-        <w:pStyle w:val="ListBullet"/>
-        <w:spacing w:after="60"/>
+        <w:spacing w:before="200" w:after="40"/>
+      </w:pPr>
+      <w:r>
+        <w:rPr>
+          <w:b/>
+          <w:color w:val="1E1610"/>
+          <w:sz w:val="24"/>
+        </w:rPr>
+        <w:t>Family &amp; friends view</w:t>
+      </w:r>
+    </w:p>
+    <w:p>
+      <w:pPr>
+        <w:spacing w:after="80"/>
+      </w:pPr>
+      <w:r>
+        <w:rPr>
+          <w:b/>
+          <w:color w:val="1E1610"/>
+          <w:sz w:val="22"/>
+        </w:rPr>
+        <w:t xml:space="preserve">URL:  </w:t>
+      </w:r>
+      <w:r>
+        <w:rPr>
+          <w:color w:val="1E1610"/>
+          <w:sz w:val="22"/>
+        </w:rPr>
+        <w:t>[YOUR NETLIFY URL HERE]/family</w:t>
+      </w:r>
+    </w:p>
+    <w:p>
+      <w:pPr>
+        <w:spacing w:after="80"/>
       </w:pPr>
       <w:r>
         <w:rPr>
           <w:color w:val="1E1610"/>
           <w:sz w:val="22"/>
         </w:rPr>
-        <w:t>36-hour window</w:t>
+        <w:t>Share this with anyone cheering you on. It shows live status and ascent progress for all athletes. No setup, nothing to tap — just open and watch.</w:t>
       </w:r>
     </w:p>
     <w:p>
       <w:pPr>
-        <w:pStyle w:val="ListBullet"/>
-        <w:spacing w:after="60"/>
-      </w:pPr>
-      <w:r>
-        <w:rPr>
-          <w:color w:val="1E1610"/>
-          <w:sz w:val="22"/>
-        </w:rPr>
-        <w:t>10 athletes, each moving at their own pace</w:t>
-      </w:r>
-    </w:p>
-    <w:p>
-      <w:pPr>
-        <w:spacing w:before="120" w:after="120"/>
-        <w:pBdr>
-          <w:bottom w:val="single" w:sz="4" w:space="1" w:color="DDD0BE"/>
-        </w:pBdr>
-      </w:pPr>
-    </w:p>
-    <w:p>
-      <w:pPr>
-        <w:spacing w:before="360" w:after="120"/>
+        <w:spacing w:before="360" w:after="80"/>
       </w:pPr>
       <w:r>
         <w:rPr>
           <w:b/>
-          <w:color w:val="7A2A3A"/>
+          <w:color w:val="A85878"/>
           <w:sz w:val="36"/>
         </w:rPr>
         <w:t>What the App Does</w:t>
@@ -170,15 +207,202 @@
     </w:p>
     <w:p>
       <w:pPr>
-        <w:spacing w:before="240" w:after="80"/>
+        <w:spacing w:before="200" w:after="40"/>
+      </w:pPr>
+      <w:r>
+        <w:rPr>
+          <w:b/>
+          <w:color w:val="1E1610"/>
+          <w:sz w:val="24"/>
+        </w:rPr>
+        <w:t>Team Board</w:t>
+      </w:r>
+    </w:p>
+    <w:p>
+      <w:pPr>
+        <w:spacing w:after="80"/>
+      </w:pPr>
+      <w:r>
+        <w:rPr>
+          <w:color w:val="1E1610"/>
+          <w:sz w:val="22"/>
+        </w:rPr>
+        <w:t>See all 10 athletes at a glance, sorted by who’s most active. Updates in real time.</w:t>
+      </w:r>
+    </w:p>
+    <w:p>
+      <w:pPr>
+        <w:spacing w:before="200" w:after="40"/>
+      </w:pPr>
+      <w:r>
+        <w:rPr>
+          <w:b/>
+          <w:color w:val="1E1610"/>
+          <w:sz w:val="24"/>
+        </w:rPr>
+        <w:t>My Dashboard</w:t>
+      </w:r>
+    </w:p>
+    <w:p>
+      <w:pPr>
+        <w:spacing w:after="80"/>
+      </w:pPr>
+      <w:r>
+        <w:rPr>
+          <w:color w:val="1E1610"/>
+          <w:sz w:val="22"/>
+        </w:rPr>
+        <w:t>Your personal view: current status, ascent count, and quick-action buttons to update your status, log a completed ascent, plan your next ascent, or track your LMNT packets.</w:t>
+      </w:r>
+    </w:p>
+    <w:p>
+      <w:pPr>
+        <w:spacing w:before="200" w:after="40"/>
+      </w:pPr>
+      <w:r>
+        <w:rPr>
+          <w:b/>
+          <w:color w:val="1E1610"/>
+          <w:sz w:val="24"/>
+        </w:rPr>
+        <w:t>Status Update</w:t>
+      </w:r>
+    </w:p>
+    <w:p>
+      <w:pPr>
+        <w:spacing w:after="80"/>
+      </w:pPr>
+      <w:r>
+        <w:rPr>
+          <w:color w:val="1E1610"/>
+          <w:sz w:val="22"/>
+        </w:rPr>
+        <w:t>One tap to tell the team what you’re doing right now. Choose from 9 statuses (listed below). Your card on the Team Board updates instantly for everyone.</w:t>
+      </w:r>
+    </w:p>
+    <w:p>
+      <w:pPr>
+        <w:spacing w:before="200" w:after="40"/>
+      </w:pPr>
+      <w:r>
+        <w:rPr>
+          <w:b/>
+          <w:color w:val="1E1610"/>
+          <w:sz w:val="24"/>
+        </w:rPr>
+        <w:t>Ascent Tracker</w:t>
+      </w:r>
+    </w:p>
+    <w:p>
+      <w:pPr>
+        <w:spacing w:after="80"/>
+      </w:pPr>
+      <w:r>
+        <w:rPr>
+          <w:color w:val="1E1610"/>
+          <w:sz w:val="22"/>
+        </w:rPr>
+        <w:t>Log each completed ascent. A celebration appears when you finish one. Your 8-triangle progress bar fills in as you go.</w:t>
+      </w:r>
+    </w:p>
+    <w:p>
+      <w:pPr>
+        <w:spacing w:before="200" w:after="40"/>
+      </w:pPr>
+      <w:r>
+        <w:rPr>
+          <w:b/>
+          <w:color w:val="1E1610"/>
+          <w:sz w:val="24"/>
+        </w:rPr>
+        <w:t>Planning Another Ascent</w:t>
+      </w:r>
+    </w:p>
+    <w:p>
+      <w:pPr>
+        <w:spacing w:after="80"/>
+      </w:pPr>
+      <w:r>
+        <w:rPr>
+          <w:color w:val="1E1610"/>
+          <w:sz w:val="22"/>
+        </w:rPr>
+        <w:t>When you’re resting between ascents and getting ready to head back up, you can signal the team. Choose from: Starting Now, Starting Within 10 Minutes, or Starting Within 30 Minutes. A chip appears on your athlete card so the team knows to expect you. Clear it once you’re climbing.</w:t>
+      </w:r>
+    </w:p>
+    <w:p>
+      <w:pPr>
+        <w:spacing w:before="200" w:after="40"/>
+      </w:pPr>
+      <w:r>
+        <w:rPr>
+          <w:b/>
+          <w:color w:val="1E1610"/>
+          <w:sz w:val="24"/>
+        </w:rPr>
+        <w:t>LMNT Tracker</w:t>
+      </w:r>
+    </w:p>
+    <w:p>
+      <w:pPr>
+        <w:spacing w:after="80"/>
+      </w:pPr>
+      <w:r>
+        <w:rPr>
+          <w:color w:val="1E1610"/>
+          <w:sz w:val="22"/>
+        </w:rPr>
+        <w:t>Set your target (12 or 18 packets for the event) and track how many you’ve used across 36 hours.</w:t>
+      </w:r>
+    </w:p>
+    <w:p>
+      <w:pPr>
+        <w:spacing w:before="200" w:after="40"/>
+      </w:pPr>
+      <w:r>
+        <w:rPr>
+          <w:b/>
+          <w:color w:val="1E1610"/>
+          <w:sz w:val="24"/>
+        </w:rPr>
+        <w:t>Family View</w:t>
+      </w:r>
+    </w:p>
+    <w:p>
+      <w:pPr>
+        <w:spacing w:after="80"/>
+      </w:pPr>
+      <w:r>
+        <w:rPr>
+          <w:color w:val="1E1610"/>
+          <w:sz w:val="22"/>
+        </w:rPr>
+        <w:t>A read-only, supporter-friendly view showing each athlete’s name, current status, and ascent progress. Updates live without any refresh.</w:t>
+      </w:r>
+    </w:p>
+    <w:p>
+      <w:pPr>
+        <w:spacing w:before="360" w:after="80"/>
       </w:pPr>
       <w:r>
         <w:rPr>
           <w:b/>
           <w:color w:val="A85878"/>
-          <w:sz w:val="24"/>
+          <w:sz w:val="36"/>
         </w:rPr>
-        <w:t>For Athletes</w:t>
+        <w:t>Available Statuses</w:t>
+      </w:r>
+    </w:p>
+    <w:p>
+      <w:pPr>
+        <w:spacing w:after="80"/>
+      </w:pPr>
+      <w:r>
+        <w:rPr>
+          <w:color w:val="1E1610"/>
+          <w:sz w:val="22"/>
+        </w:rPr>
+        <w:t>Athletes can set any of these 9 statuses from the Status screen:</w:t>
       </w:r>
     </w:p>
     <w:p>
@@ -192,14 +416,14 @@
           <w:color w:val="1E1610"/>
           <w:sz w:val="22"/>
         </w:rPr>
-        <w:t xml:space="preserve">Status — </w:t>
+        <w:t xml:space="preserve">Starting Soon:  </w:t>
       </w:r>
       <w:r>
         <w:rPr>
           <w:color w:val="1E1610"/>
           <w:sz w:val="22"/>
         </w:rPr>
-        <w:t>One-tap status updates</w:t>
+        <w:t>Getting ready to head up. Default before the event begins.</w:t>
       </w:r>
     </w:p>
     <w:p>
@@ -213,14 +437,14 @@
           <w:color w:val="1E1610"/>
           <w:sz w:val="22"/>
         </w:rPr>
-        <w:t xml:space="preserve">Ascents — </w:t>
+        <w:t xml:space="preserve">Climbing:  </w:t>
       </w:r>
       <w:r>
         <w:rPr>
           <w:color w:val="1E1610"/>
           <w:sz w:val="22"/>
         </w:rPr>
-        <w:t>Track completed ascents with satisfying mountain icons</w:t>
+        <w:t>On the way up the mountain.</w:t>
       </w:r>
     </w:p>
     <w:p>
@@ -234,227 +458,7 @@
           <w:color w:val="1E1610"/>
           <w:sz w:val="22"/>
         </w:rPr>
-        <w:t xml:space="preserve">Recovery — </w:t>
-      </w:r>
-      <w:r>
-        <w:rPr>
-          <w:color w:val="1E1610"/>
-          <w:sz w:val="22"/>
-        </w:rPr>
-        <w:t>Log LMNT electrolyte packets consumed across the event</w:t>
-      </w:r>
-    </w:p>
-    <w:p>
-      <w:pPr>
-        <w:pStyle w:val="ListBullet"/>
-        <w:spacing w:after="60"/>
-      </w:pPr>
-      <w:r>
-        <w:rPr>
-          <w:b/>
-          <w:color w:val="1E1610"/>
-          <w:sz w:val="22"/>
-        </w:rPr>
-        <w:t xml:space="preserve">Team View — </w:t>
-      </w:r>
-      <w:r>
-        <w:rPr>
-          <w:color w:val="1E1610"/>
-          <w:sz w:val="22"/>
-        </w:rPr>
-        <w:t>See the full team board in real time</w:t>
-      </w:r>
-    </w:p>
-    <w:p>
-      <w:pPr>
-        <w:spacing w:before="240" w:after="80"/>
-      </w:pPr>
-      <w:r>
-        <w:rPr>
-          <w:b/>
-          <w:color w:val="A85878"/>
-          <w:sz w:val="24"/>
-        </w:rPr>
-        <w:t>For Family &amp; Friends</w:t>
-      </w:r>
-    </w:p>
-    <w:p>
-      <w:pPr>
-        <w:spacing w:after="120"/>
-      </w:pPr>
-      <w:r>
-        <w:rPr>
-          <w:i w:val="0"/>
-          <w:color w:val="1E1610"/>
-          <w:sz w:val="22"/>
-        </w:rPr>
-        <w:t>A read-only Family View (separate URL) shows every athlete's status and progress — no login, no setup. Before the challenge starts it shows a holding page. Once athletes are on the mountain, it updates live.</w:t>
-      </w:r>
-    </w:p>
-    <w:p>
-      <w:pPr>
-        <w:spacing w:before="120" w:after="120"/>
-        <w:pBdr>
-          <w:bottom w:val="single" w:sz="4" w:space="1" w:color="DDD0BE"/>
-        </w:pBdr>
-      </w:pPr>
-    </w:p>
-    <w:p>
-      <w:pPr>
-        <w:spacing w:before="360" w:after="120"/>
-      </w:pPr>
-      <w:r>
-        <w:rPr>
-          <w:b/>
-          <w:color w:val="7A2A3A"/>
-          <w:sz w:val="36"/>
-        </w:rPr>
-        <w:t>How to Access It</w:t>
-      </w:r>
-    </w:p>
-    <w:p>
-      <w:pPr>
-        <w:spacing w:after="120"/>
-      </w:pPr>
-      <w:r>
-        <w:rPr>
-          <w:i w:val="0"/>
-          <w:color w:val="1E1610"/>
-          <w:sz w:val="22"/>
-        </w:rPr>
-        <w:t>The app is a mobile-first web app — no download needed. Open the link below on your phone and save it to your home screen for the best experience.</w:t>
-      </w:r>
-    </w:p>
-    <w:p>
-      <w:pPr>
-        <w:spacing w:after="160"/>
-      </w:pPr>
-      <w:r>
-        <w:rPr>
-          <w:b/>
-          <w:color w:val="1E1610"/>
-          <w:sz w:val="22"/>
-        </w:rPr>
-        <w:t xml:space="preserve">Athlete URL:  </w:t>
-      </w:r>
-      <w:r>
-        <w:rPr>
-          <w:i/>
-          <w:color w:val="A85878"/>
-          <w:sz w:val="22"/>
-        </w:rPr>
-        <w:t>[your-netlify-url].netlify.app</w:t>
-      </w:r>
-    </w:p>
-    <w:p>
-      <w:pPr>
-        <w:spacing w:after="160"/>
-      </w:pPr>
-      <w:r>
-        <w:rPr>
-          <w:b/>
-          <w:color w:val="1E1610"/>
-          <w:sz w:val="22"/>
-        </w:rPr>
-        <w:t xml:space="preserve">Family URL:  </w:t>
-      </w:r>
-      <w:r>
-        <w:rPr>
-          <w:i/>
-          <w:color w:val="A85878"/>
-          <w:sz w:val="22"/>
-        </w:rPr>
-        <w:t>[your-netlify-url].netlify.app/family</w:t>
-      </w:r>
-    </w:p>
-    <w:p>
-      <w:pPr>
-        <w:spacing w:after="120"/>
-      </w:pPr>
-      <w:r>
-        <w:rPr>
-          <w:i w:val="0"/>
-          <w:color w:val="1E1610"/>
-          <w:sz w:val="22"/>
-        </w:rPr>
-        <w:t>On first open, athletes tap their name to identify themselves. This is saved on your device — you won't be asked again.</w:t>
-      </w:r>
-    </w:p>
-    <w:p>
-      <w:pPr>
-        <w:spacing w:before="120" w:after="120"/>
-        <w:pBdr>
-          <w:bottom w:val="single" w:sz="4" w:space="1" w:color="DDD0BE"/>
-        </w:pBdr>
-      </w:pPr>
-    </w:p>
-    <w:p>
-      <w:pPr>
-        <w:spacing w:before="360" w:after="120"/>
-      </w:pPr>
-      <w:r>
-        <w:rPr>
-          <w:b/>
-          <w:color w:val="7A2A3A"/>
-          <w:sz w:val="36"/>
-        </w:rPr>
-        <w:t>Available Statuses</w:t>
-      </w:r>
-    </w:p>
-    <w:p>
-      <w:pPr>
-        <w:pStyle w:val="ListBullet"/>
-        <w:spacing w:after="60"/>
-      </w:pPr>
-      <w:r>
-        <w:rPr>
-          <w:b/>
-          <w:color w:val="1E1610"/>
-          <w:sz w:val="22"/>
-        </w:rPr>
-        <w:t xml:space="preserve">Starting Soon — </w:t>
-      </w:r>
-      <w:r>
-        <w:rPr>
-          <w:color w:val="1E1610"/>
-          <w:sz w:val="22"/>
-        </w:rPr>
-        <w:t>You're heading up the mountain</w:t>
-      </w:r>
-    </w:p>
-    <w:p>
-      <w:pPr>
-        <w:pStyle w:val="ListBullet"/>
-        <w:spacing w:after="60"/>
-      </w:pPr>
-      <w:r>
-        <w:rPr>
-          <w:b/>
-          <w:color w:val="1E1610"/>
-          <w:sz w:val="22"/>
-        </w:rPr>
-        <w:t xml:space="preserve">Climbing — </w:t>
-      </w:r>
-      <w:r>
-        <w:rPr>
-          <w:color w:val="1E1610"/>
-          <w:sz w:val="22"/>
-        </w:rPr>
-        <w:t>On the way up</w:t>
-      </w:r>
-    </w:p>
-    <w:p>
-      <w:pPr>
-        <w:pStyle w:val="ListBullet"/>
-        <w:spacing w:after="60"/>
-      </w:pPr>
-      <w:r>
-        <w:rPr>
-          <w:b/>
-          <w:color w:val="1E1610"/>
-          <w:sz w:val="22"/>
-        </w:rPr>
-        <w:t xml:space="preserve">Summit — </w:t>
+        <w:t xml:space="preserve">Summit:  </w:t>
       </w:r>
       <w:r>
         <w:rPr>
@@ -475,14 +479,14 @@
           <w:color w:val="1E1610"/>
           <w:sz w:val="22"/>
         </w:rPr>
-        <w:t xml:space="preserve">Fueling at Top — </w:t>
+        <w:t xml:space="preserve">Fueling at Top:  </w:t>
       </w:r>
       <w:r>
         <w:rPr>
           <w:color w:val="1E1610"/>
           <w:sz w:val="22"/>
         </w:rPr>
-        <w:t>Eating at the top before descending</w:t>
+        <w:t>Eating and refueling at the summit area.</w:t>
       </w:r>
     </w:p>
     <w:p>
@@ -496,14 +500,14 @@
           <w:color w:val="1E1610"/>
           <w:sz w:val="22"/>
         </w:rPr>
-        <w:t xml:space="preserve">Gondola Down — </w:t>
+        <w:t xml:space="preserve">Gondola Down:  </w:t>
       </w:r>
       <w:r>
         <w:rPr>
           <w:color w:val="1E1610"/>
           <w:sz w:val="22"/>
         </w:rPr>
-        <w:t>Riding the gondola down</w:t>
+        <w:t>Riding the gondola back to the base.</w:t>
       </w:r>
     </w:p>
     <w:p>
@@ -517,14 +521,14 @@
           <w:color w:val="1E1610"/>
           <w:sz w:val="22"/>
         </w:rPr>
-        <w:t xml:space="preserve">Recovery — </w:t>
+        <w:t xml:space="preserve">Wellness Room:  </w:t>
       </w:r>
       <w:r>
         <w:rPr>
           <w:color w:val="1E1610"/>
           <w:sz w:val="22"/>
         </w:rPr>
-        <w:t>Resting and resetting at the bottom</w:t>
+        <w:t>At the base recovery area — resting, stretching, resetting.</w:t>
       </w:r>
     </w:p>
     <w:p>
@@ -538,14 +542,14 @@
           <w:color w:val="1E1610"/>
           <w:sz w:val="22"/>
         </w:rPr>
-        <w:t xml:space="preserve">Fueling at Bottom — </w:t>
+        <w:t xml:space="preserve">Fueling at Bottom:  </w:t>
       </w:r>
       <w:r>
         <w:rPr>
           <w:color w:val="1E1610"/>
           <w:sz w:val="22"/>
         </w:rPr>
-        <w:t>Eating at the bottom</w:t>
+        <w:t>Eating and refueling at the base.</w:t>
       </w:r>
     </w:p>
     <w:p>
@@ -559,14 +563,14 @@
           <w:color w:val="1E1610"/>
           <w:sz w:val="22"/>
         </w:rPr>
-        <w:t xml:space="preserve">Sleeping — </w:t>
+        <w:t xml:space="preserve">Sleeping:  </w:t>
       </w:r>
       <w:r>
         <w:rPr>
           <w:color w:val="1E1610"/>
           <w:sz w:val="22"/>
         </w:rPr>
-        <w:t>Getting rest between ascents</w:t>
+        <w:t>Getting rest between ascents.</w:t>
       </w:r>
     </w:p>
     <w:p>
@@ -580,209 +584,237 @@
           <w:color w:val="1E1610"/>
           <w:sz w:val="22"/>
         </w:rPr>
-        <w:t xml:space="preserve">Finished — </w:t>
+        <w:t xml:space="preserve">Finished:  </w:t>
       </w:r>
       <w:r>
         <w:rPr>
           <w:color w:val="1E1610"/>
           <w:sz w:val="22"/>
         </w:rPr>
-        <w:t>All done!</w:t>
+        <w:t>All 8 ascents complete. Marks the full ascent count as done.</w:t>
       </w:r>
     </w:p>
     <w:p>
       <w:pPr>
-        <w:spacing w:before="120" w:after="120"/>
-        <w:pBdr>
-          <w:bottom w:val="single" w:sz="4" w:space="1" w:color="DDD0BE"/>
-        </w:pBdr>
-      </w:pPr>
-    </w:p>
-    <w:p>
-      <w:pPr>
-        <w:spacing w:before="360" w:after="120"/>
-      </w:pPr>
-      <w:r>
-        <w:rPr>
-          <w:b/>
-          <w:color w:val="7A2A3A"/>
-          <w:sz w:val="36"/>
-        </w:rPr>
-        <w:t>What We'd Love Your Help Testing</w:t>
-      </w:r>
-    </w:p>
-    <w:p>
-      <w:pPr>
-        <w:spacing w:before="240" w:after="80"/>
+        <w:spacing w:before="360" w:after="80"/>
       </w:pPr>
       <w:r>
         <w:rPr>
           <w:b/>
           <w:color w:val="A85878"/>
-          <w:sz w:val="24"/>
+          <w:sz w:val="36"/>
         </w:rPr>
-        <w:t>1. Status Updates</w:t>
+        <w:t>What We’d Love Your Help Testing</w:t>
       </w:r>
     </w:p>
     <w:p>
       <w:pPr>
-        <w:spacing w:after="120"/>
+        <w:spacing w:before="200" w:after="40"/>
       </w:pPr>
       <w:r>
         <w:rPr>
-          <w:i w:val="0"/>
+          <w:b/>
           <w:color w:val="1E1610"/>
-          <w:sz w:val="22"/>
+          <w:sz w:val="24"/>
         </w:rPr>
-        <w:t>Tap through several statuses. Does it update immediately? Does the Team board reflect your change right away? Try doing it from two different phones at the same time.</w:t>
+        <w:t>1. First-time setup</w:t>
       </w:r>
     </w:p>
     <w:p>
       <w:pPr>
-        <w:spacing w:before="240" w:after="80"/>
+        <w:spacing w:after="80"/>
+      </w:pPr>
+      <w:r>
+        <w:rPr>
+          <w:color w:val="1E1610"/>
+          <w:sz w:val="22"/>
+        </w:rPr>
+        <w:t>Open the app fresh. Does the name-selection screen appear? After you tap your name, does it remember you if you close and reopen the app?</w:t>
+      </w:r>
+    </w:p>
+    <w:p>
+      <w:pPr>
+        <w:spacing w:before="200" w:after="40"/>
+      </w:pPr>
+      <w:r>
+        <w:rPr>
+          <w:b/>
+          <w:color w:val="1E1610"/>
+          <w:sz w:val="24"/>
+        </w:rPr>
+        <w:t>2. Status updates</w:t>
+      </w:r>
+    </w:p>
+    <w:p>
+      <w:pPr>
+        <w:spacing w:after="80"/>
+      </w:pPr>
+      <w:r>
+        <w:rPr>
+          <w:color w:val="1E1610"/>
+          <w:sz w:val="22"/>
+        </w:rPr>
+        <w:t>Try a few different statuses. Does your card on the Team Board update immediately? Does the Family view reflect it too?</w:t>
+      </w:r>
+    </w:p>
+    <w:p>
+      <w:pPr>
+        <w:spacing w:before="200" w:after="40"/>
+      </w:pPr>
+      <w:r>
+        <w:rPr>
+          <w:b/>
+          <w:color w:val="1E1610"/>
+          <w:sz w:val="24"/>
+        </w:rPr>
+        <w:t>3. Ascent logging</w:t>
+      </w:r>
+    </w:p>
+    <w:p>
+      <w:pPr>
+        <w:spacing w:after="80"/>
+      </w:pPr>
+      <w:r>
+        <w:rPr>
+          <w:color w:val="1E1610"/>
+          <w:sz w:val="22"/>
+        </w:rPr>
+        <w:t>Mark an ascent complete. Does the triangle fill in and a celebration appear? Try undoing it — does the count go back?</w:t>
+      </w:r>
+    </w:p>
+    <w:p>
+      <w:pPr>
+        <w:spacing w:before="200" w:after="40"/>
+      </w:pPr>
+      <w:r>
+        <w:rPr>
+          <w:b/>
+          <w:color w:val="1E1610"/>
+          <w:sz w:val="24"/>
+        </w:rPr>
+        <w:t>4. Planning another ascent</w:t>
+      </w:r>
+    </w:p>
+    <w:p>
+      <w:pPr>
+        <w:spacing w:after="80"/>
+      </w:pPr>
+      <w:r>
+        <w:rPr>
+          <w:color w:val="1E1610"/>
+          <w:sz w:val="22"/>
+        </w:rPr>
+        <w:t>From My Dashboard, find the ‘Planning Another Ascent’ option and set a start time. Does a chip appear on your card on the Team Board? Is this feature easy to find, or did it take a moment to locate? Does the placement feel intuitive to you — or would you expect to find it somewhere else in the app?</w:t>
+      </w:r>
+    </w:p>
+    <w:p>
+      <w:pPr>
+        <w:spacing w:before="200" w:after="40"/>
+      </w:pPr>
+      <w:r>
+        <w:rPr>
+          <w:b/>
+          <w:color w:val="1E1610"/>
+          <w:sz w:val="24"/>
+        </w:rPr>
+        <w:t>5. LMNT tracker</w:t>
+      </w:r>
+    </w:p>
+    <w:p>
+      <w:pPr>
+        <w:spacing w:after="80"/>
+      </w:pPr>
+      <w:r>
+        <w:rPr>
+          <w:color w:val="1E1610"/>
+          <w:sz w:val="22"/>
+        </w:rPr>
+        <w:t>Set your packet target and increment the count. Close and reopen — does your count persist?</w:t>
+      </w:r>
+    </w:p>
+    <w:p>
+      <w:pPr>
+        <w:spacing w:before="200" w:after="40"/>
+      </w:pPr>
+      <w:r>
+        <w:rPr>
+          <w:b/>
+          <w:color w:val="1E1610"/>
+          <w:sz w:val="24"/>
+        </w:rPr>
+        <w:t>6. Family view</w:t>
+      </w:r>
+    </w:p>
+    <w:p>
+      <w:pPr>
+        <w:spacing w:after="80"/>
+      </w:pPr>
+      <w:r>
+        <w:rPr>
+          <w:color w:val="1E1610"/>
+          <w:sz w:val="22"/>
+        </w:rPr>
+        <w:t>Open the /family URL on a second device or send it to someone. Does it load without setup? When you update your status, does the family view refresh automatically?</w:t>
+      </w:r>
+    </w:p>
+    <w:p>
+      <w:pPr>
+        <w:spacing w:before="200" w:after="40"/>
+      </w:pPr>
+      <w:r>
+        <w:rPr>
+          <w:b/>
+          <w:color w:val="1E1610"/>
+          <w:sz w:val="24"/>
+        </w:rPr>
+        <w:t>7. Real-time sync</w:t>
+      </w:r>
+    </w:p>
+    <w:p>
+      <w:pPr>
+        <w:spacing w:after="80"/>
+      </w:pPr>
+      <w:r>
+        <w:rPr>
+          <w:color w:val="1E1610"/>
+          <w:sz w:val="22"/>
+        </w:rPr>
+        <w:t>Have two people open the app simultaneously. When one updates her status, how quickly does the other person see it?</w:t>
+      </w:r>
+    </w:p>
+    <w:p>
+      <w:pPr>
+        <w:spacing w:before="200" w:after="40"/>
+      </w:pPr>
+      <w:r>
+        <w:rPr>
+          <w:b/>
+          <w:color w:val="1E1610"/>
+          <w:sz w:val="24"/>
+        </w:rPr>
+        <w:t>8. Phone usability</w:t>
+      </w:r>
+    </w:p>
+    <w:p>
+      <w:pPr>
+        <w:spacing w:after="80"/>
+      </w:pPr>
+      <w:r>
+        <w:rPr>
+          <w:color w:val="1E1610"/>
+          <w:sz w:val="22"/>
+        </w:rPr>
+        <w:t>Everything is designed for iPhone. Does it feel right? Are buttons easy to tap? Anything too small, too cramped, or confusing?</w:t>
+      </w:r>
+    </w:p>
+    <w:p>
+      <w:pPr>
+        <w:spacing w:before="360" w:after="80"/>
       </w:pPr>
       <w:r>
         <w:rPr>
           <w:b/>
           <w:color w:val="A85878"/>
-          <w:sz w:val="24"/>
-        </w:rPr>
-        <w:t>2. Ascent Tracking</w:t>
-      </w:r>
-    </w:p>
-    <w:p>
-      <w:pPr>
-        <w:spacing w:after="120"/>
-      </w:pPr>
-      <w:r>
-        <w:rPr>
-          <w:i w:val="0"/>
-          <w:color w:val="1E1610"/>
-          <w:sz w:val="22"/>
-        </w:rPr>
-        <w:t>Go to the Me tab and mark an ascent complete. Does the celebration message appear? Do your mountain icons fill in correctly? Try the Undo button too.</w:t>
-      </w:r>
-    </w:p>
-    <w:p>
-      <w:pPr>
-        <w:spacing w:before="240" w:after="80"/>
-      </w:pPr>
-      <w:r>
-        <w:rPr>
-          <w:b/>
-          <w:color w:val="A85878"/>
-          <w:sz w:val="24"/>
-        </w:rPr>
-        <w:t>3. LMNT Tracker</w:t>
-      </w:r>
-    </w:p>
-    <w:p>
-      <w:pPr>
-        <w:spacing w:after="120"/>
-      </w:pPr>
-      <w:r>
-        <w:rPr>
-          <w:i w:val="0"/>
-          <w:color w:val="1E1610"/>
-          <w:sz w:val="22"/>
-        </w:rPr>
-        <w:t>Go to the Recovery tab. Set a target (12 or 18 packets). Tap the individual dots and use the +/− buttons. Does your count persist if you close and reopen the app?</w:t>
-      </w:r>
-    </w:p>
-    <w:p>
-      <w:pPr>
-        <w:spacing w:before="240" w:after="80"/>
-      </w:pPr>
-      <w:r>
-        <w:rPr>
-          <w:b/>
-          <w:color w:val="A85878"/>
-          <w:sz w:val="24"/>
-        </w:rPr>
-        <w:t>4. Family View</w:t>
-      </w:r>
-    </w:p>
-    <w:p>
-      <w:pPr>
-        <w:spacing w:after="120"/>
-      </w:pPr>
-      <w:r>
-        <w:rPr>
-          <w:i w:val="0"/>
-          <w:color w:val="1E1610"/>
-          <w:sz w:val="22"/>
-        </w:rPr>
-        <w:t>Open the Family URL on a second device (or send it to someone). When you update your status on the athlete app, does it appear on the Family view within a few seconds?</w:t>
-      </w:r>
-    </w:p>
-    <w:p>
-      <w:pPr>
-        <w:spacing w:before="240" w:after="80"/>
-      </w:pPr>
-      <w:r>
-        <w:rPr>
-          <w:b/>
-          <w:color w:val="A85878"/>
-          <w:sz w:val="24"/>
-        </w:rPr>
-        <w:t>5. Real-Time Updates</w:t>
-      </w:r>
-    </w:p>
-    <w:p>
-      <w:pPr>
-        <w:spacing w:after="120"/>
-      </w:pPr>
-      <w:r>
-        <w:rPr>
-          <w:i w:val="0"/>
-          <w:color w:val="1E1610"/>
-          <w:sz w:val="22"/>
-        </w:rPr>
-        <w:t>This is the big one. Have two people open the app simultaneously and update statuses. Both boards should update within 1–2 seconds without refreshing.</w:t>
-      </w:r>
-    </w:p>
-    <w:p>
-      <w:pPr>
-        <w:spacing w:before="240" w:after="80"/>
-      </w:pPr>
-      <w:r>
-        <w:rPr>
-          <w:b/>
-          <w:color w:val="A85878"/>
-          <w:sz w:val="24"/>
-        </w:rPr>
-        <w:t>6. Phone Feel</w:t>
-      </w:r>
-    </w:p>
-    <w:p>
-      <w:pPr>
-        <w:spacing w:after="120"/>
-      </w:pPr>
-      <w:r>
-        <w:rPr>
-          <w:i w:val="0"/>
-          <w:color w:val="1E1610"/>
-          <w:sz w:val="22"/>
-        </w:rPr>
-        <w:t>Does it feel natural on your phone? Are buttons easy to tap? Does anything feel confusing or out of place? We want this to be effortless at 3am on hour 28 of the challenge.</w:t>
-      </w:r>
-    </w:p>
-    <w:p>
-      <w:pPr>
-        <w:spacing w:before="120" w:after="120"/>
-        <w:pBdr>
-          <w:bottom w:val="single" w:sz="4" w:space="1" w:color="DDD0BE"/>
-        </w:pBdr>
-      </w:pPr>
-    </w:p>
-    <w:p>
-      <w:pPr>
-        <w:spacing w:before="360" w:after="120"/>
-      </w:pPr>
-      <w:r>
-        <w:rPr>
-          <w:b/>
-          <w:color w:val="7A2A3A"/>
           <w:sz w:val="36"/>
         </w:rPr>
         <w:t>How to Share Feedback</w:t>
@@ -790,15 +822,14 @@
     </w:p>
     <w:p>
       <w:pPr>
-        <w:spacing w:after="120"/>
+        <w:spacing w:after="80"/>
       </w:pPr>
       <w:r>
         <w:rPr>
-          <w:i w:val="0"/>
           <w:color w:val="1E1610"/>
           <w:sz w:val="22"/>
         </w:rPr>
-        <w:t>No formal process — just send your notes directly to Taryn. Screenshots of anything broken are especially helpful. We're looking for:</w:t>
+        <w:t>Text Taryn directly with anything that feels off, confusing, or broken. Screenshots are especially helpful. When you report something, please include:</w:t>
       </w:r>
     </w:p>
     <w:p>
@@ -811,7 +842,7 @@
           <w:color w:val="1E1610"/>
           <w:sz w:val="22"/>
         </w:rPr>
-        <w:t>Anything that didn't work as expected</w:t>
+        <w:t>What happened (describe the issue or what felt wrong)</w:t>
       </w:r>
     </w:p>
     <w:p>
@@ -824,7 +855,7 @@
           <w:color w:val="1E1610"/>
           <w:sz w:val="22"/>
         </w:rPr>
-        <w:t>Anything confusing or unclear</w:t>
+        <w:t>What you expected to happen</w:t>
       </w:r>
     </w:p>
     <w:p>
@@ -837,7 +868,7 @@
           <w:color w:val="1E1610"/>
           <w:sz w:val="22"/>
         </w:rPr>
-        <w:t>Anything you wished the app did differently</w:t>
+        <w:t>Your device — e.g. iPhone 15 Pro, iPhone 13 mini</w:t>
       </w:r>
     </w:p>
     <w:p>
@@ -850,28 +881,43 @@
           <w:color w:val="1E1610"/>
           <w:sz w:val="22"/>
         </w:rPr>
-        <w:t>Anything that felt really right</w:t>
+        <w:t>Your iOS version — Settings → General → About → iOS Version</w:t>
       </w:r>
     </w:p>
     <w:p>
       <w:pPr>
-        <w:spacing w:before="120" w:after="120"/>
-        <w:pBdr>
-          <w:bottom w:val="single" w:sz="4" w:space="1" w:color="DDD0BE"/>
-        </w:pBdr>
+        <w:pStyle w:val="ListBullet"/>
+        <w:spacing w:after="60"/>
       </w:pPr>
+      <w:r>
+        <w:rPr>
+          <w:color w:val="1E1610"/>
+          <w:sz w:val="22"/>
+        </w:rPr>
+        <w:t>Your browser — e.g. Safari, Chrome</w:t>
+      </w:r>
     </w:p>
     <w:p>
       <w:pPr>
-        <w:spacing w:before="240"/>
+        <w:pStyle w:val="ListBullet"/>
+        <w:spacing w:after="60"/>
       </w:pPr>
       <w:r>
         <w:rPr>
-          <w:i/>
-          <w:color w:val="8C7B6E"/>
-          <w:sz w:val="18"/>
+          <w:color w:val="1E1610"/>
+          <w:sz w:val="22"/>
         </w:rPr>
-        <w:t>Built for the 29029 Whistler 2026 team. Private and not for redistribution.</w:t>
+        <w:t>Any other detail that might help — e.g. WiFi or cellular?</w:t>
+      </w:r>
+    </w:p>
+    <w:p/>
+    <w:p>
+      <w:r>
+        <w:rPr>
+          <w:color w:val="1E1610"/>
+          <w:sz w:val="22"/>
+        </w:rPr>
+        <w:t>Thank you for helping make this great before we head to Whistler. You’re the best team. 🏔️</w:t>
       </w:r>
     </w:p>
     <w:sectPr>

</xml_diff>